<commit_message>
docs: padroniza nome do autor e contratado para Davi Felinto nos documentos oficiais
</commit_message>
<xml_diff>
--- a/docs/comercial/Contrato_Prestacao_Servicos_Clinix.docx
+++ b/docs/comercial/Contrato_Prestacao_Servicos_Clinix.docx
@@ -97,7 +97,7 @@
                 <w:color w:val="334155"/>
                 <w:sz w:val="19"/>
               </w:rPr>
-              <w:t>DAVI FELINTO DOS SANTOS, brasileiro, solteiro, desenvolvedor e engenheiro de software, inscrito no CPF sob o nº [000.000.000-00], residente e domiciliado em Brasília, Distrito Federal, contato eletrônico: davifd0978@gmail.com, doravante denominado simplesmente CONTRATADO.</w:t>
+              <w:t>DAVI FELINTO, brasileiro, solteiro, desenvolvedor e engenheiro de software, inscrito no CPF sob o nº [000.000.000-00], residente e domiciliado em Brasília, Distrito Federal, contato eletrônico: davifd0978@gmail.com, doravante denominado simplesmente CONTRATADO.</w:t>
             </w:r>
           </w:p>
         </w:tc>
@@ -652,7 +652,7 @@
           <w:color w:val="334155"/>
           <w:sz w:val="20"/>
         </w:rPr>
-        <w:t>3.1. O software CLINIX, seu código-fonte, arquitetura de sistemas, modelos conceituais de banco de dados, algoritmos, fluxos operacionais, interfaces de usuário, marcas e documentações técnicas são de PROPRIEDADE INTELECTUAL EXCLUSIVA, UNIVERSAL E INALIENÁVEL DO CONTRATADO (DAVI FELINTO DOS SANTOS), protegidos pela Lei de Software (Lei nº 9.609/1998) e pela Lei de Direitos Autorais (Lei nº 9.610/1998).</w:t>
+        <w:t>3.1. O software CLINIX, seu código-fonte, arquitetura de sistemas, modelos conceituais de banco de dados, algoritmos, fluxos operacionais, interfaces de usuário, marcas e documentações técnicas são de PROPRIEDADE INTELECTUAL EXCLUSIVA, UNIVERSAL E INALIENÁVEL DO CONTRATADO (DAVI FELINTO), protegidos pela Lei de Software (Lei nº 9.609/1998) e pela Lei de Direitos Autorais (Lei nº 9.610/1998).</w:t>
       </w:r>
     </w:p>
     <w:p>
@@ -1286,7 +1286,7 @@
         <w:rPr>
           <w:sz w:val="19"/>
         </w:rPr>
-        <w:t>CONTRATADO: DAVI FELINTO DOS SANTOS</w:t>
+        <w:t>CONTRATADO: DAVI FELINTO</w:t>
         <w:br/>
         <w:t>CPF: [000.000.000-00]</w:t>
         <w:br/>
@@ -1577,7 +1577,7 @@
           <w:color w:val="334155"/>
           <w:sz w:val="19"/>
         </w:rPr>
-        <w:t>Davi Felinto dos Santos</w:t>
+        <w:t>Davi Felinto</w:t>
       </w:r>
     </w:p>
     <w:p>

</xml_diff>